<commit_message>
Sync latest paper edits
</commit_message>
<xml_diff>
--- a/exports/synthetic-roth-contribution.docx
+++ b/exports/synthetic-roth-contribution.docx
@@ -715,7 +715,7 @@
         <w:pStyle w:val="BodyText"/>
       </w:pPr>
       <w:r>
-        <w:t xml:space="preserve">This is the closest published decomposition of outside-funded conversion value. It differs from the SRC framework in three ways: (a) the value depends on</w:t>
+        <w:t xml:space="preserve">This is the closest published decomposition of outside-funded conversion value. It differs from the SRC framework in two ways: (a) the value depends on</w:t>
       </w:r>
       <w:r>
         <w:t xml:space="preserve"> </w:t>
@@ -738,7 +738,7 @@
         <w:t xml:space="preserve"> </w:t>
       </w:r>
       <w:r>
-        <w:t xml:space="preserve">— i.e., it operates entirely through tax-drag arbitrage in the alternative wrapper — and collapses to zero when the taxable account has no drag, whereas the SRC’s PV-equivalence identity (§4) holds at the wrapper level itself and survives even when</w:t>
+        <w:t xml:space="preserve">— it operates entirely through tax-drag arbitrage in the alternative wrapper and collapses to zero when the taxable account has no drag, whereas the SRC’s PV-equivalence identity (§4) holds at the wrapper level itself and survives even when</w:t>
       </w:r>
       <w:r>
         <w:t xml:space="preserve"> </w:t>
@@ -758,7 +758,7 @@
         </m:r>
       </m:oMath>
       <w:r>
-        <w:t xml:space="preserve">; (b) Reichenstein &amp; Meyer give an end-of-period FV expression but do not provide a per-year cash-flow stream isolating the tax-payment-source as a separable IRR; and (c) they do not state the present-value identity</w:t>
+        <w:t xml:space="preserve">; and (b) Reichenstein &amp; Meyer give an end-of-period FV expression without the per-year cash-flow stream, separable IRR, or PV-equivalence identity</w:t>
       </w:r>
       <w:r>
         <w:t xml:space="preserve"> </w:t>
@@ -822,7 +822,7 @@
         <w:t xml:space="preserve"> </w:t>
       </w:r>
       <w:r>
-        <w:t xml:space="preserve">at the portfolio rate or derive a separable Break-Even Tax Rate adjustment. Their Strategy 3 captures the same economic phenomenon the SRC names; their formalism leaves the per-year structure, PV identity, and BETR extension unstated.</w:t>
+        <w:t xml:space="preserve">at the portfolio rate that the SRC framework develops.</w:t>
       </w:r>
     </w:p>
     <w:p>
@@ -1025,7 +1025,7 @@
         <w:t xml:space="preserve"> </w:t>
       </w:r>
       <w:r>
-        <w:t xml:space="preserve">algebraic proof of PV equivalence at the portfolio rate; (b) empirical paired-run validation against a production calculation engine to within rounding; (c) the RMD generalization showing the identity holds under non-uniform distribution paths; and (d) the separable IRR decomposition contrasting Outside (real IRR) with Inside (sentinel-flag IRR). The present work is positioned as a rigorous extension, not a re-claim, of the framework introduced there.</w:t>
+        <w:t xml:space="preserve">algebraic proof of PV equivalence at the portfolio rate; (b) empirical paired-run validation against a production calculation engine to within rounding; (c) the RMD generalization showing the identity holds under non-uniform distribution paths; and (d) the separable IRR decomposition on the Outside-funded cash-flow stream. The present work is positioned as a rigorous extension, not a re-claim, of the framework introduced there.</w:t>
       </w:r>
     </w:p>
     <w:p>
@@ -1056,7 +1056,7 @@
         <w:t xml:space="preserve">Size Matters in the Roth IRA Conversion Decision</w:t>
       </w:r>
       <w:r>
-        <w:t xml:space="preserve">, Elm Wealth (June 18, 2025); republished by Advisor Perspectives (July 14, 2025) — is the closest independent later articulation. Nalebuff supplies the mathematical core; Haghani and White publish it. Their</w:t>
+        <w:t xml:space="preserve">, Elm Wealth (June 18, 2025); republished by Advisor Perspectives (July 14, 2025) — is the closest independent later articulation. Their</w:t>
       </w:r>
       <w:r>
         <w:t xml:space="preserve"> </w:t>
@@ -1193,7 +1193,7 @@
         <w:t xml:space="preserve"> </w:t>
       </w:r>
       <w:r>
-        <w:t xml:space="preserve">heuristic. The framing is independently arrived at and substantively aligned with the SRC concept, but their formula collapses ordinary-income and capital-gains rates into one expression and presents the wrapper-transition benefit as a single Benefit and Break-Even-Tax-Rate calculation rather than as a per-year separable stream with its own IRR and PV identity. Notably, this work post-dates Cheshire (2025) by approximately ten weeks; we cite it as parallel evidence that the concept is being independently surfaced, not as priority.</w:t>
+        <w:t xml:space="preserve">heuristic. The framing is substantively aligned with the SRC concept, but the formula collapses ordinary-income and capital-gains rates into one expression and presents the wrapper-transition benefit as a single Benefit and BETR calculation rather than a per-year separable stream with its own IRR and PV identity. This work post-dates Cheshire (2025) by approximately ten weeks; we cite it as parallel evidence that the concept is being independently surfaced, not as priority.</w:t>
       </w:r>
     </w:p>
     <w:p>
@@ -1255,7 +1255,42 @@
         <w:t xml:space="preserve"> </w:t>
       </w:r>
       <w:r>
-        <w:t xml:space="preserve">— extends the Break-Even Tax Rate framework by treating the conversion-tax-payment source as an input. Their Appendix A worked example shows BETR dropping from 35% (no outside payment) to 29.6%, 23.5%, and 14.1% as the outside source becomes more tax-inefficient (or as backdoor contribution capacity is invoked). Outside-payment is folded into a single break-even number, not a separate IRR / FV / PV bucket. Our SRC extension treats the outside-payment value as a first-class quantity with its own measurement, complementing Vanguard’s BETR by making explicit what Vanguard’s model treats as a parameter adjustment.</w:t>
+        <w:t xml:space="preserve">— extends the Break-Even Tax Rate framework to take the conversion-tax-payment source as a parameter input. BETR subtracts a</w:t>
+      </w:r>
+      <w:r>
+        <w:t xml:space="preserve"> </w:t>
+      </w:r>
+      <w:r>
+        <w:t xml:space="preserve">“forgone after-tax value”</w:t>
+      </w:r>
+      <w:r>
+        <w:t xml:space="preserve"> </w:t>
+      </w:r>
+      <w:r>
+        <w:t xml:space="preserve">of the conversion-tax dollar from the Roth side of the comparison, collapsing the Roth and outside-cash position into a single net figure; the deduction cancels symmetrically against an analogous implicit omission in the no-conversion counterfactual, so the BETR rate itself is mathematically correct. The convention, however, obscures the wrapper-migration mechanic, and the assumed taxable-account growth rate multiple,</w:t>
+      </w:r>
+      <w:r>
+        <w:t xml:space="preserve"> </w:t>
+      </w:r>
+      <m:oMath>
+        <m:sSup>
+          <m:e>
+            <m:r>
+              <m:t>M</m:t>
+            </m:r>
+          </m:e>
+          <m:sup>
+            <m:r>
+              <m:rPr>
+                <m:sty m:val="p"/>
+              </m:rPr>
+              <m:t>′</m:t>
+            </m:r>
+          </m:sup>
+        </m:sSup>
+      </m:oMath>
+      <w:r>
+        <w:t xml:space="preserve">, that the convention treats as a neutral input is in fact the recommendation driver. The SRC framework makes the wrapper migration explicit and quantifies the outside-payment value as a first-class component rather than embedding it in a parameter adjustment.</w:t>
       </w:r>
     </w:p>
     <w:p>
@@ -1286,19 +1321,68 @@
         <w:t xml:space="preserve">The Arithmetic of Roth Conversions</w:t>
       </w:r>
       <w:r>
-        <w:t xml:space="preserve">, Journal of Financial Planning, May 2023 — explicitly tabulates the year-by-year wealth wedge between Inside-paid and Outside-paid branches at constant tax rates ($1,343 at year 3, $8,319 at year 10, $40,386 at year 20 in their illustration) and names</w:t>
-      </w:r>
-      <w:r>
-        <w:t xml:space="preserve"> </w:t>
-      </w:r>
-      <w:r>
-        <w:t xml:space="preserve">“tax drag compounding”</w:t>
-      </w:r>
-      <w:r>
-        <w:t xml:space="preserve"> </w:t>
-      </w:r>
-      <w:r>
-        <w:t xml:space="preserve">as the source. They report this as a wealth-difference time series rather than as a separable IRR / PV / FV bucket and do not state the PV-equivalence identity. Their numerical evidence is consistent with the SRC framework’s predictions and provides additional empirical support for the wrapper-transition mechanism.</w:t>
+        <w:t xml:space="preserve">, Journal of Financial Planning, May 2023 — explicitly tabulates the year-by-year wealth wedge between Inside-paid and Outside-paid branches at constant tax rates ($1,343 at year 3, $8,319 at year 10, $40,386 at year 20 in their illustration), with the drag-rate differential between Roth (</w:t>
+      </w:r>
+      <m:oMath>
+        <m:r>
+          <m:t>r</m:t>
+        </m:r>
+      </m:oMath>
+      <w:r>
+        <w:t xml:space="preserve">) and taxable wrapper (</w:t>
+      </w:r>
+      <m:oMath>
+        <m:sSup>
+          <m:e>
+            <m:r>
+              <m:t>r</m:t>
+            </m:r>
+          </m:e>
+          <m:sup>
+            <m:r>
+              <m:rPr>
+                <m:sty m:val="p"/>
+              </m:rPr>
+              <m:t>′</m:t>
+            </m:r>
+          </m:sup>
+        </m:sSup>
+        <m:r>
+          <m:rPr>
+            <m:sty m:val="p"/>
+          </m:rPr>
+          <m:t>=</m:t>
+        </m:r>
+        <m:r>
+          <m:t>r</m:t>
+        </m:r>
+        <m:r>
+          <m:rPr>
+            <m:sty m:val="p"/>
+          </m:rPr>
+          <m:t>(</m:t>
+        </m:r>
+        <m:r>
+          <m:t>1</m:t>
+        </m:r>
+        <m:r>
+          <m:rPr>
+            <m:sty m:val="p"/>
+          </m:rPr>
+          <m:t>−</m:t>
+        </m:r>
+        <m:r>
+          <m:t>t</m:t>
+        </m:r>
+        <m:r>
+          <m:rPr>
+            <m:sty m:val="p"/>
+          </m:rPr>
+          <m:t>)</m:t>
+        </m:r>
+      </m:oMath>
+      <w:r>
+        <w:t xml:space="preserve">) as the underlying source. They report this as a wealth-difference time series rather than as a separable IRR / PV / FV bucket and do not state the PV-equivalence identity. Their numerical evidence is consistent with the SRC framework’s predictions and provides additional empirical support for the wrapper-transition mechanism.</w:t>
       </w:r>
     </w:p>
     <w:p>
@@ -1346,12 +1430,61 @@
       <w:r>
         <w:t xml:space="preserve"> </w:t>
       </w:r>
-      <w:r>
-        <w:rPr>
-          <w:rStyle w:val="VerbatimChar"/>
-        </w:rPr>
-        <w:t xml:space="preserve">PV(Outside − Inside) = 0</w:t>
-      </w:r>
+      <m:oMath>
+        <m:r>
+          <m:rPr>
+            <m:sty m:val="p"/>
+          </m:rPr>
+          <m:t>P</m:t>
+        </m:r>
+        <m:r>
+          <m:rPr>
+            <m:sty m:val="p"/>
+          </m:rPr>
+          <m:t>V</m:t>
+        </m:r>
+        <m:r>
+          <m:rPr>
+            <m:sty m:val="p"/>
+          </m:rPr>
+          <m:t>(</m:t>
+        </m:r>
+        <m:r>
+          <m:rPr>
+            <m:nor/>
+            <m:sty m:val="p"/>
+          </m:rPr>
+          <m:t>Outside</m:t>
+        </m:r>
+        <m:r>
+          <m:rPr>
+            <m:sty m:val="p"/>
+          </m:rPr>
+          <m:t>−</m:t>
+        </m:r>
+        <m:r>
+          <m:rPr>
+            <m:nor/>
+            <m:sty m:val="p"/>
+          </m:rPr>
+          <m:t>Inside</m:t>
+        </m:r>
+        <m:r>
+          <m:rPr>
+            <m:sty m:val="p"/>
+          </m:rPr>
+          <m:t>)</m:t>
+        </m:r>
+        <m:r>
+          <m:rPr>
+            <m:sty m:val="p"/>
+          </m:rPr>
+          <m:t>=</m:t>
+        </m:r>
+        <m:r>
+          <m:t>0</m:t>
+        </m:r>
+      </m:oMath>
       <w:r>
         <w:t xml:space="preserve"> </w:t>
       </w:r>
@@ -1361,14 +1494,67 @@
       <w:r>
         <w:t xml:space="preserve"> </w:t>
       </w:r>
-      <w:r>
-        <w:rPr>
-          <w:rStyle w:val="VerbatimChar"/>
-        </w:rPr>
-        <w:t xml:space="preserve">discount = r</w:t>
-      </w:r>
-      <w:r>
-        <w:t xml:space="preserve">. Where McQuarrie reads this identity as a refutation of the practical importance of outside-payment, the SRC framework reads it as confirmation that the outside-payment value is exactly the conversion tax in year-0 dollars (the contribution-equivalent), with lasting economic significance arising through the tax-drag channel of §6.1. The two readings are mathematically identical and economically opposite; clarifying this distinction is one of the contributions of the present paper.</w:t>
+      <m:oMath>
+        <m:r>
+          <m:rPr>
+            <m:sty m:val="p"/>
+          </m:rPr>
+          <m:t>d</m:t>
+        </m:r>
+        <m:r>
+          <m:rPr>
+            <m:sty m:val="p"/>
+          </m:rPr>
+          <m:t>i</m:t>
+        </m:r>
+        <m:r>
+          <m:rPr>
+            <m:sty m:val="p"/>
+          </m:rPr>
+          <m:t>s</m:t>
+        </m:r>
+        <m:r>
+          <m:rPr>
+            <m:sty m:val="p"/>
+          </m:rPr>
+          <m:t>c</m:t>
+        </m:r>
+        <m:r>
+          <m:rPr>
+            <m:sty m:val="p"/>
+          </m:rPr>
+          <m:t>o</m:t>
+        </m:r>
+        <m:r>
+          <m:rPr>
+            <m:sty m:val="p"/>
+          </m:rPr>
+          <m:t>u</m:t>
+        </m:r>
+        <m:r>
+          <m:rPr>
+            <m:sty m:val="p"/>
+          </m:rPr>
+          <m:t>n</m:t>
+        </m:r>
+        <m:r>
+          <m:rPr>
+            <m:sty m:val="p"/>
+          </m:rPr>
+          <m:t>t</m:t>
+        </m:r>
+        <m:r>
+          <m:rPr>
+            <m:sty m:val="p"/>
+          </m:rPr>
+          <m:t>=</m:t>
+        </m:r>
+        <m:r>
+          <m:t>r</m:t>
+        </m:r>
+      </m:oMath>
+      <w:r>
+        <w:t xml:space="preserve">. Where McQuarrie reads this identity as a refutation of the practical importance of outside-payment, the SRC framework reads it as confirmation that the outside-payment value is exactly the conversion tax in year-0 dollars (the contribution-equivalent), with lasting economic significance arising through the tax-drag channel of §6.1. The two readings are mathematically identical and economically opposite.</w:t>
       </w:r>
     </w:p>
     <w:p>
@@ -2017,7 +2203,7 @@
         <w:t xml:space="preserve"> </w:t>
       </w:r>
       <w:r>
-        <w:t xml:space="preserve">and Advisor Perspectives series); the Bogleheads NPV threads; Williams (AAII Research Triangle, June 2024); White Coat Investor; Allan Roth; Christine Benz / Morningstar; and the Schwab / Fidelity / T. Rowe Price retirement-research series — all advise paying conversion tax from outside funds when feasible. To our knowledge, none separates the value of that practice as a standalone IRR / PV / FV bucket, none states the PV identity, and none derives a separable BETR extension. The qualitative advice is widely repeated; the formal decomposition appears to be absent from this body of work.</w:t>
+        <w:t xml:space="preserve">and Advisor Perspectives series); the Bogleheads NPV threads; and major retirement-research publications from Schwab, Fidelity, T. Rowe Price, and Morningstar — all advise paying conversion tax from outside funds when feasible. To our knowledge, none separates the value of that practice as a standalone IRR / PV / FV bucket, none states the PV identity, and none derives a separable BETR extension. The qualitative advice is widely repeated; the formal decomposition appears to be absent from this body of work.</w:t>
       </w:r>
     </w:p>
     <w:p>
@@ -2126,7 +2312,7 @@
               <w:pStyle w:val="Compact"/>
             </w:pPr>
             <w:r>
-              <w:t xml:space="preserve">Effective marginal conversion-year tax rate (after Social Security, IRMAA, bracket effects)</w:t>
+              <w:t xml:space="preserve">Effective marginal conversion-year tax rate (after Social Security and bracket effects)</w:t>
             </w:r>
           </w:p>
         </w:tc>
@@ -2248,7 +2434,45 @@
               <w:pStyle w:val="Compact"/>
             </w:pPr>
             <w:r>
-              <w:t xml:space="preserve">Effective return rate on a taxable account, after tax drag</w:t>
+              <w:t xml:space="preserve">Effective return rate on a taxable account, after tax drag;</w:t>
+            </w:r>
+            <w:r>
+              <w:t xml:space="preserve"> </w:t>
+            </w:r>
+            <w:r>
+              <w:rPr>
+                <w:i/>
+                <w:iCs/>
+              </w:rPr>
+              <w:t xml:space="preserve">r_d = r · (1 - d)</w:t>
+            </w:r>
+          </w:p>
+        </w:tc>
+      </w:tr>
+      <w:tr>
+        <w:tc>
+          <w:tcPr/>
+          <w:p>
+            <w:pPr>
+              <w:pStyle w:val="Compact"/>
+            </w:pPr>
+            <w:r>
+              <w:rPr>
+                <w:i/>
+                <w:iCs/>
+              </w:rPr>
+              <w:t xml:space="preserve">d</w:t>
+            </w:r>
+          </w:p>
+        </w:tc>
+        <w:tc>
+          <w:tcPr/>
+          <w:p>
+            <w:pPr>
+              <w:pStyle w:val="Compact"/>
+            </w:pPr>
+            <w:r>
+              <w:t xml:space="preserve">Annual drag fraction on a taxable account’s return</w:t>
             </w:r>
           </w:p>
         </w:tc>
@@ -3183,7 +3407,7 @@
         </m:r>
       </m:oMath>
       <w:r>
-        <w:t xml:space="preserve">, the $22,000 immediate settlement extinguishes a liability with face value $25,000 in PV terms. The household captures the $3,000 difference as a balance-sheet gain — the rate-arbitrage Core of the conversion’s NPV.</w:t>
+        <w:t xml:space="preserve">, the $22,000 immediate settlement extinguishes a $25,000 liability. The household captures the $3,000 difference as a balance-sheet gain — the rate-arbitrage Core of the conversion’s NPV.</w:t>
       </w:r>
     </w:p>
     <w:p>

</xml_diff>

<commit_message>
Sync paper edits + regenerated docx
</commit_message>
<xml_diff>
--- a/exports/synthetic-roth-contribution.docx
+++ b/exports/synthetic-roth-contribution.docx
@@ -10692,7 +10692,7 @@
         <w:pStyle w:val="BodyText"/>
       </w:pPr>
       <w:r>
-        <w:t xml:space="preserve">The engine computes it via a closed-form multiplier rather than by integrating the year stream:</w:t>
+        <w:t xml:space="preserve">The engine computes the lifetime nominal payout as a per-dollar multiple of the conversion-tax outlay:</w:t>
       </w:r>
     </w:p>
     <w:p>
@@ -10704,92 +10704,35 @@
           <m:jc m:val="center"/>
         </m:oMathParaPr>
         <m:oMath>
-          <m:eqArr>
-            <m:e>
-              <m:r>
-                <m:rPr>
-                  <m:nor/>
-                  <m:sty m:val="p"/>
-                </m:rPr>
-                <m:t>Lifetime nominal payout</m:t>
-              </m:r>
-              <m:r>
-                <m:t>&amp;</m:t>
-              </m:r>
-              <m:r>
-                <m:rPr>
-                  <m:sty m:val="p"/>
-                </m:rPr>
-                <m:t>=</m:t>
-              </m:r>
-              <m:r>
-                <m:t>K</m:t>
-              </m:r>
-              <m:r>
-                <m:rPr>
-                  <m:sty m:val="p"/>
-                </m:rPr>
-                <m:t>⋅</m:t>
-              </m:r>
-              <m:r>
-                <m:rPr>
-                  <m:nor/>
-                  <m:sty m:val="p"/>
-                </m:rPr>
-                <m:t>payout multiple</m:t>
-              </m:r>
-            </m:e>
-            <m:e>
-              <m:r>
-                <m:rPr>
-                  <m:nor/>
-                  <m:sty m:val="p"/>
-                </m:rPr>
-                <m:t>payout multiple</m:t>
-              </m:r>
-              <m:r>
-                <m:t>&amp;</m:t>
-              </m:r>
-              <m:r>
-                <m:rPr>
-                  <m:sty m:val="p"/>
-                </m:rPr>
-                <m:t>=</m:t>
-              </m:r>
-              <m:f>
-                <m:fPr>
-                  <m:type m:val="bar"/>
-                </m:fPr>
-                <m:num>
-                  <m:r>
-                    <m:rPr>
-                      <m:nor/>
-                      <m:sty m:val="p"/>
-                    </m:rPr>
-                    <m:t>Total ATCF Change (FV)</m:t>
-                  </m:r>
-                </m:num>
-                <m:den>
-                  <m:r>
-                    <m:t>K</m:t>
-                  </m:r>
-                  <m:r>
-                    <m:rPr>
-                      <m:sty m:val="p"/>
-                    </m:rPr>
-                    <m:t>+</m:t>
-                  </m:r>
-                  <m:r>
-                    <m:rPr>
-                      <m:nor/>
-                      <m:sty m:val="p"/>
-                    </m:rPr>
-                    <m:t>Tax-Rate Spread (FV)</m:t>
-                  </m:r>
-                </m:den>
-              </m:f>
-            </m:e>
-          </m:eqArr>
+          <m:r>
+            <m:rPr>
+              <m:nor/>
+              <m:sty m:val="p"/>
+            </m:rPr>
+            <m:t>Lifetime nominal payout</m:t>
+          </m:r>
+          <m:r>
+            <m:rPr>
+              <m:sty m:val="p"/>
+            </m:rPr>
+            <m:t>=</m:t>
+          </m:r>
+          <m:r>
+            <m:t>K</m:t>
+          </m:r>
+          <m:r>
+            <m:rPr>
+              <m:sty m:val="p"/>
+            </m:rPr>
+            <m:t>⋅</m:t>
+          </m:r>
+          <m:r>
+            <m:rPr>
+              <m:nor/>
+              <m:sty m:val="p"/>
+            </m:rPr>
+            <m:t>payout multiple</m:t>
+          </m:r>
         </m:oMath>
       </m:oMathPara>
     </w:p>
@@ -10798,7 +10741,123 @@
         <w:pStyle w:val="FirstParagraph"/>
       </w:pPr>
       <w:r>
-        <w:t xml:space="preserve">For the Outside RMD scenario, the payout multiple is 3.9647, so the lifetime nominal payout = $17,966 × 3.9647 = $71,229.59.</w:t>
+        <w:t xml:space="preserve">The payout multiple is a structural property of the household’s distribution schedule. Under FA distribution, it equals</w:t>
+      </w:r>
+      <w:r>
+        <w:t xml:space="preserve"> </w:t>
+      </w:r>
+      <m:oMath>
+        <m:r>
+          <m:rPr>
+            <m:sty m:val="p"/>
+          </m:rPr>
+          <m:t>A</m:t>
+        </m:r>
+        <m:r>
+          <m:rPr>
+            <m:sty m:val="p"/>
+          </m:rPr>
+          <m:t>F</m:t>
+        </m:r>
+        <m:r>
+          <m:rPr>
+            <m:sty m:val="p"/>
+          </m:rPr>
+          <m:t>(</m:t>
+        </m:r>
+        <m:r>
+          <m:t>r</m:t>
+        </m:r>
+        <m:r>
+          <m:rPr>
+            <m:sty m:val="p"/>
+          </m:rPr>
+          <m:t>,</m:t>
+        </m:r>
+        <m:r>
+          <m:t>N</m:t>
+        </m:r>
+        <m:r>
+          <m:rPr>
+            <m:sty m:val="p"/>
+          </m:rPr>
+          <m:t>)</m:t>
+        </m:r>
+        <m:r>
+          <m:rPr>
+            <m:sty m:val="p"/>
+          </m:rPr>
+          <m:t>⋅</m:t>
+        </m:r>
+        <m:r>
+          <m:t>N</m:t>
+        </m:r>
+      </m:oMath>
+      <w:r>
+        <w:t xml:space="preserve"> </w:t>
+      </w:r>
+      <w:r>
+        <w:t xml:space="preserve">(1.88786 in our scenario, with</w:t>
+      </w:r>
+      <w:r>
+        <w:t xml:space="preserve"> </w:t>
+      </w:r>
+      <m:oMath>
+        <m:r>
+          <m:t>r</m:t>
+        </m:r>
+        <m:r>
+          <m:rPr>
+            <m:sty m:val="p"/>
+          </m:rPr>
+          <m:t>=</m:t>
+        </m:r>
+        <m:r>
+          <m:t>7</m:t>
+        </m:r>
+        <m:r>
+          <m:rPr>
+            <m:sty m:val="p"/>
+          </m:rPr>
+          <m:t>%</m:t>
+        </m:r>
+      </m:oMath>
+      <w:r>
+        <w:t xml:space="preserve">,</w:t>
+      </w:r>
+      <w:r>
+        <w:t xml:space="preserve"> </w:t>
+      </w:r>
+      <m:oMath>
+        <m:r>
+          <m:t>N</m:t>
+        </m:r>
+        <m:r>
+          <m:rPr>
+            <m:sty m:val="p"/>
+          </m:rPr>
+          <m:t>=</m:t>
+        </m:r>
+        <m:r>
+          <m:t>20</m:t>
+        </m:r>
+      </m:oMath>
+      <w:r>
+        <w:t xml:space="preserve">). Under RMD distribution, it is determined empirically from the year-by-year RMD divisor schedule applied to the SRC’s</w:t>
+      </w:r>
+      <w:r>
+        <w:t xml:space="preserve"> </w:t>
+      </w:r>
+      <m:oMath>
+        <m:r>
+          <m:t>K</m:t>
+        </m:r>
+      </m:oMath>
+      <w:r>
+        <w:t xml:space="preserve"> </w:t>
+      </w:r>
+      <w:r>
+        <w:t xml:space="preserve">dollars. For the Outside RMD scenario, the payout multiple is 3.9647, so the lifetime nominal payout = $17,966 × 3.9647 = $71,229.59.</w:t>
       </w:r>
     </w:p>
     <w:p>
@@ -11687,7 +11746,7 @@
         <w:t xml:space="preserve"> </w:t>
       </w:r>
       <w:r>
-        <w:t xml:space="preserve">on the converted principal); the IRMAA / Medicare alpha (a separable channel for households whose post-conversion income strategy improves their Medicare-surcharge bracket exposure; not decomposed in this paper); and the RMD tax-drag alpha (drag avoided on the reinvested-RMD stream the household no longer has to take, since the conversion shrinks the Traditional balance and thereby reduces lifetime RMDs — a channel present for both Inside and Outside conversions, since the RMD reduction is a consequence of the conversion event itself, not the funding source). An Inside conversion is rational if the sum of these alpha components is PV-positive, since Inside funding requires no outside cash outlay.</w:t>
+        <w:t xml:space="preserve">on the converted principal); the IRMAA / Medicare alpha (a separable channel for households whose post-conversion income strategy improves their Medicare-surcharge bracket exposure; not decomposed in this paper); and the RMD tax-drag alpha (drag avoided on the reinvested-RMD stream that the conversion eliminates by shrinking the Traditional balance; present for both Inside and Outside conversions, since the RMD reduction follows from the conversion event itself, not the funding source). An Inside conversion is rational if the sum of these alpha components is PV-positive, since Inside funding requires no outside cash outlay.</w:t>
       </w:r>
     </w:p>
     <w:p>
@@ -13932,6 +13991,41 @@
             </w:pPr>
             <w:r>
               <w:t xml:space="preserve">$3,362.08</w:t>
+            </w:r>
+          </w:p>
+        </w:tc>
+      </w:tr>
+      <w:tr>
+        <w:tc>
+          <w:tcPr/>
+          <w:p>
+            <w:pPr>
+              <w:pStyle w:val="Compact"/>
+            </w:pPr>
+            <w:r>
+              <w:t xml:space="preserve">Payout Multiple</w:t>
+            </w:r>
+          </w:p>
+        </w:tc>
+        <w:tc>
+          <w:tcPr/>
+          <w:p>
+            <w:pPr>
+              <w:pStyle w:val="Compact"/>
+            </w:pPr>
+            <w:r>
+              <w:t xml:space="preserve">3.9647</w:t>
+            </w:r>
+          </w:p>
+        </w:tc>
+        <w:tc>
+          <w:tcPr/>
+          <w:p>
+            <w:pPr>
+              <w:pStyle w:val="Compact"/>
+            </w:pPr>
+            <w:r>
+              <w:t xml:space="preserve">3.9647</w:t>
             </w:r>
           </w:p>
         </w:tc>

</xml_diff>

<commit_message>
Restructure section 5.1 table to drop Predicted increment column, add PV column
</commit_message>
<xml_diff>
--- a/exports/synthetic-roth-contribution.docx
+++ b/exports/synthetic-roth-contribution.docx
@@ -2,37 +2,6 @@
 <file path=word/document.xml><?xml version="1.0" encoding="utf-8"?>
 <w:document xmlns:w="http://schemas.openxmlformats.org/wordprocessingml/2006/main" xmlns:m="http://schemas.openxmlformats.org/officeDocument/2006/math" xmlns:r="http://schemas.openxmlformats.org/officeDocument/2006/relationships" xmlns:o="urn:schemas-microsoft-com:office:office" xmlns:v="urn:schemas-microsoft-com:vml" xmlns:w10="urn:schemas-microsoft-com:office:word" xmlns:a="http://schemas.openxmlformats.org/drawingml/2006/main" xmlns:pic="http://schemas.openxmlformats.org/drawingml/2006/picture" xmlns:wp="http://schemas.openxmlformats.org/drawingml/2006/wordprocessingDrawing">
   <w:body>
-    <w:sdt>
-      <w:sdtPr>
-        <w:docPartObj>
-          <w:docPartGallery w:val="Table of Contents"/>
-          <w:docPartUnique/>
-        </w:docPartObj>
-      </w:sdtPr>
-      <w:sdtContent>
-        <w:p>
-          <w:pPr>
-            <w:pStyle w:val="TOCHeading"/>
-          </w:pPr>
-          <w:r>
-            <w:t xml:space="preserve">Table of Contents</w:t>
-          </w:r>
-        </w:p>
-        <w:p>
-          <w:r>
-            <w:fldChar w:fldCharType="begin" w:dirty="true"/>
-            <w:instrText xml:space="preserve">TOC \o "1-3" \h \z \u</w:instrText>
-            <w:fldChar w:fldCharType="separate"/>
-            <w:fldChar w:fldCharType="end"/>
-          </w:r>
-        </w:p>
-      </w:sdtContent>
-    </w:sdt>
-    <w:p>
-      <w:r>
-        <w:br w:type="page"/>
-      </w:r>
-    </w:p>
     <w:bookmarkStart w:id="44" w:name="X6d2ad215d2e6367c7cb1eff0628692cb8617c07"/>
     <w:p>
       <w:pPr>
@@ -5968,18 +5937,18 @@
               <w:pStyle w:val="Compact"/>
             </w:pPr>
             <w:r>
-              <w:t xml:space="preserve">Outside − Inside</w:t>
-            </w:r>
-          </w:p>
-        </w:tc>
-        <w:tc>
-          <w:tcPr/>
-          <w:p>
-            <w:pPr>
-              <w:pStyle w:val="Compact"/>
-            </w:pPr>
-            <w:r>
-              <w:t xml:space="preserve">Predicted increment</w:t>
+              <w:t xml:space="preserve">Outside − Inside (nom)</w:t>
+            </w:r>
+          </w:p>
+        </w:tc>
+        <w:tc>
+          <w:tcPr/>
+          <w:p>
+            <w:pPr>
+              <w:pStyle w:val="Compact"/>
+            </w:pPr>
+            <w:r>
+              <w:t xml:space="preserve">Outside − Inside (PV @ 7%)</w:t>
             </w:r>
           </w:p>
         </w:tc>
@@ -6047,7 +6016,7 @@
               <w:pStyle w:val="Compact"/>
             </w:pPr>
             <w:r>
-              <w:t xml:space="preserve">year-0 outflow</w:t>
+              <w:t xml:space="preserve">$−17,966</w:t>
             </w:r>
           </w:p>
         </w:tc>
@@ -6115,7 +6084,7 @@
               <w:pStyle w:val="Compact"/>
             </w:pPr>
             <w:r>
-              <w:t xml:space="preserve">$1,695.86 ✓</w:t>
+              <w:t xml:space="preserve">$1,585</w:t>
             </w:r>
           </w:p>
         </w:tc>
@@ -6183,7 +6152,7 @@
               <w:pStyle w:val="Compact"/>
             </w:pPr>
             <w:r>
-              <w:t xml:space="preserve">$1,695.86 ✓</w:t>
+              <w:t xml:space="preserve">$1,481</w:t>
             </w:r>
           </w:p>
         </w:tc>
@@ -6251,7 +6220,7 @@
               <w:pStyle w:val="Compact"/>
             </w:pPr>
             <w:r>
-              <w:t xml:space="preserve">$1,695.86 ✓</w:t>
+              <w:t xml:space="preserve">$1,384</w:t>
             </w:r>
           </w:p>
         </w:tc>
@@ -6319,7 +6288,7 @@
               <w:pStyle w:val="Compact"/>
             </w:pPr>
             <w:r>
-              <w:t xml:space="preserve">$1,695.86 ✓</w:t>
+              <w:t xml:space="preserve">$1,294</w:t>
             </w:r>
           </w:p>
         </w:tc>
@@ -6387,7 +6356,7 @@
               <w:pStyle w:val="Compact"/>
             </w:pPr>
             <w:r>
-              <w:t xml:space="preserve">$1,695.86 ✓</w:t>
+              <w:t xml:space="preserve">$1,209</w:t>
             </w:r>
           </w:p>
         </w:tc>
@@ -6455,7 +6424,7 @@
               <w:pStyle w:val="Compact"/>
             </w:pPr>
             <w:r>
-              <w:t xml:space="preserve">$1,695.86 ✓</w:t>
+              <w:t xml:space="preserve">$1,130</w:t>
             </w:r>
           </w:p>
         </w:tc>
@@ -6523,7 +6492,7 @@
               <w:pStyle w:val="Compact"/>
             </w:pPr>
             <w:r>
-              <w:t xml:space="preserve">$1,695.86 ✓</w:t>
+              <w:t xml:space="preserve">$1,056</w:t>
             </w:r>
           </w:p>
         </w:tc>
@@ -6591,7 +6560,7 @@
               <w:pStyle w:val="Compact"/>
             </w:pPr>
             <w:r>
-              <w:t xml:space="preserve">$1,695.86 ✓</w:t>
+              <w:t xml:space="preserve">$987</w:t>
             </w:r>
           </w:p>
         </w:tc>
@@ -6659,7 +6628,7 @@
               <w:pStyle w:val="Compact"/>
             </w:pPr>
             <w:r>
-              <w:t xml:space="preserve">$1,695.86 ✓</w:t>
+              <w:t xml:space="preserve">$923</w:t>
             </w:r>
           </w:p>
         </w:tc>
@@ -6727,7 +6696,7 @@
               <w:pStyle w:val="Compact"/>
             </w:pPr>
             <w:r>
-              <w:t xml:space="preserve">$1,695.86 ✓</w:t>
+              <w:t xml:space="preserve">$862</w:t>
             </w:r>
           </w:p>
         </w:tc>
@@ -6795,7 +6764,7 @@
               <w:pStyle w:val="Compact"/>
             </w:pPr>
             <w:r>
-              <w:t xml:space="preserve">$1,695.86 ✓</w:t>
+              <w:t xml:space="preserve">$806</w:t>
             </w:r>
           </w:p>
         </w:tc>
@@ -6863,7 +6832,7 @@
               <w:pStyle w:val="Compact"/>
             </w:pPr>
             <w:r>
-              <w:t xml:space="preserve">$1,695.86 ✓</w:t>
+              <w:t xml:space="preserve">$753</w:t>
             </w:r>
           </w:p>
         </w:tc>
@@ -6931,7 +6900,7 @@
               <w:pStyle w:val="Compact"/>
             </w:pPr>
             <w:r>
-              <w:t xml:space="preserve">$1,695.86 ✓</w:t>
+              <w:t xml:space="preserve">$704</w:t>
             </w:r>
           </w:p>
         </w:tc>
@@ -6999,7 +6968,7 @@
               <w:pStyle w:val="Compact"/>
             </w:pPr>
             <w:r>
-              <w:t xml:space="preserve">$1,695.86 ✓</w:t>
+              <w:t xml:space="preserve">$658</w:t>
             </w:r>
           </w:p>
         </w:tc>
@@ -7067,7 +7036,7 @@
               <w:pStyle w:val="Compact"/>
             </w:pPr>
             <w:r>
-              <w:t xml:space="preserve">$1,695.86 ✓</w:t>
+              <w:t xml:space="preserve">⋯</w:t>
             </w:r>
           </w:p>
         </w:tc>
@@ -7135,7 +7104,7 @@
               <w:pStyle w:val="Compact"/>
             </w:pPr>
             <w:r>
-              <w:t xml:space="preserve">$1,695.86 ✓</w:t>
+              <w:t xml:space="preserve">$438</w:t>
             </w:r>
           </w:p>
         </w:tc>
@@ -7205,20 +7174,10 @@
                 <w:b/>
                 <w:bCs/>
               </w:rPr>
-              <w:t xml:space="preserve">$15,951</w:t>
-            </w:r>
-          </w:p>
-        </w:tc>
-        <w:tc>
-          <w:tcPr/>
-          <w:p>
-            <w:pPr>
-              <w:pStyle w:val="Compact"/>
-            </w:pPr>
-          </w:p>
-        </w:tc>
-      </w:tr>
-      <w:tr>
+              <w:t xml:space="preserve">+$15,951</w:t>
+            </w:r>
+          </w:p>
+        </w:tc>
         <w:tc>
           <w:tcPr/>
           <w:p>
@@ -7230,69 +7189,8 @@
                 <w:b/>
                 <w:bCs/>
               </w:rPr>
-              <w:t xml:space="preserve">20-yr PV @ 7%</w:t>
-            </w:r>
-          </w:p>
-        </w:tc>
-        <w:tc>
-          <w:tcPr/>
-          <w:p>
-            <w:pPr>
-              <w:pStyle w:val="Compact"/>
-            </w:pPr>
-          </w:p>
-        </w:tc>
-        <w:tc>
-          <w:tcPr/>
-          <w:p>
-            <w:pPr>
-              <w:pStyle w:val="Compact"/>
-            </w:pPr>
-            <w:r>
-              <w:rPr>
-                <w:b/>
-                <w:bCs/>
-              </w:rPr>
-              <w:t xml:space="preserve">$9,766</w:t>
-            </w:r>
-          </w:p>
-        </w:tc>
-        <w:tc>
-          <w:tcPr/>
-          <w:p>
-            <w:pPr>
-              <w:pStyle w:val="Compact"/>
-            </w:pPr>
-            <w:r>
-              <w:rPr>
-                <w:b/>
-                <w:bCs/>
-              </w:rPr>
-              <w:t xml:space="preserve">$9,766</w:t>
-            </w:r>
-          </w:p>
-        </w:tc>
-        <w:tc>
-          <w:tcPr/>
-          <w:p>
-            <w:pPr>
-              <w:pStyle w:val="Compact"/>
-            </w:pPr>
-            <w:r>
-              <w:rPr>
-                <w:b/>
-                <w:bCs/>
-              </w:rPr>
-              <w:t xml:space="preserve">$0</w:t>
-            </w:r>
-          </w:p>
-        </w:tc>
-        <w:tc>
-          <w:tcPr/>
-          <w:p>
-            <w:pPr>
-              <w:pStyle w:val="Compact"/>
-            </w:pPr>
+              <w:t xml:space="preserve">+$0</w:t>
+            </w:r>
           </w:p>
         </w:tc>
       </w:tr>
@@ -7322,31 +7220,13 @@
           <w:b/>
           <w:bCs/>
         </w:rPr>
-        <w:t xml:space="preserve">$1,696 (rounded; $1,695.86 unrounded) in every distribution year 2027–2046</w:t>
-      </w:r>
-      <w:r>
-        <w:t xml:space="preserve">. The Outside-scenario data reports per-year increments matching the algebraic prediction to the dollar in all 20 distribution years — the SRC’s structural per-year contribution is</w:t>
-      </w:r>
-      <w:r>
-        <w:t xml:space="preserve"> </w:t>
-      </w:r>
-      <w:r>
-        <w:rPr>
-          <w:b/>
-          <w:bCs/>
-        </w:rPr>
-        <w:t xml:space="preserve">uniform across all 20 years</w:t>
-      </w:r>
-      <w:r>
-        <w:t xml:space="preserve">.</w:t>
-      </w:r>
-    </w:p>
-    <w:p>
-      <w:pPr>
-        <w:pStyle w:val="BodyText"/>
-      </w:pPr>
-      <w:r>
-        <w:t xml:space="preserve">We verify the predicted constant against the algebraic formula:</w:t>
+        <w:t xml:space="preserve">constant at $1,696 in every distribution year 2027–2046</w:t>
+      </w:r>
+      <w:r>
+        <w:t xml:space="preserve"> </w:t>
+      </w:r>
+      <w:r>
+        <w:t xml:space="preserve">($1,695.86 to two decimals). The SRC’s structural per-year contribution is uniform across all 20 years, matching the algebraic prediction:</w:t>
       </w:r>
     </w:p>
     <w:p>
@@ -7653,68 +7533,7 @@
         <w:pStyle w:val="FirstParagraph"/>
       </w:pPr>
       <w:r>
-        <w:t xml:space="preserve">The PV column is the decisive empirical evidence:</w:t>
-      </w:r>
-    </w:p>
-    <w:p>
-      <w:pPr>
-        <w:pStyle w:val="Compact"/>
-        <w:numPr>
-          <w:ilvl w:val="0"/>
-          <w:numId w:val="1003"/>
-        </w:numPr>
-      </w:pPr>
-      <w:r>
-        <w:rPr>
-          <w:b/>
-          <w:bCs/>
-        </w:rPr>
-        <w:t xml:space="preserve">Inside ΔATCF total PV at 7%: $9,766</w:t>
-      </w:r>
-    </w:p>
-    <w:p>
-      <w:pPr>
-        <w:pStyle w:val="Compact"/>
-        <w:numPr>
-          <w:ilvl w:val="0"/>
-          <w:numId w:val="1003"/>
-        </w:numPr>
-      </w:pPr>
-      <w:r>
-        <w:rPr>
-          <w:b/>
-          <w:bCs/>
-        </w:rPr>
-        <w:t xml:space="preserve">Outside ΔATCF total PV at 7%: $9,766</w:t>
-      </w:r>
-    </w:p>
-    <w:p>
-      <w:pPr>
-        <w:pStyle w:val="FirstParagraph"/>
-      </w:pPr>
-      <w:r>
-        <w:t xml:space="preserve">These are equal</w:t>
-      </w:r>
-      <w:r>
-        <w:t xml:space="preserve"> </w:t>
-      </w:r>
-      <w:r>
-        <w:rPr>
-          <w:b/>
-          <w:bCs/>
-        </w:rPr>
-        <w:t xml:space="preserve">to the dollar</w:t>
-      </w:r>
-      <w:r>
-        <w:t xml:space="preserve">. Identical PV is the empirical signature of the algebraic identity proved in Section 4.</w:t>
-      </w:r>
-    </w:p>
-    <w:p>
-      <w:pPr>
-        <w:pStyle w:val="BodyText"/>
-      </w:pPr>
-      <w:r>
-        <w:t xml:space="preserve">Reconciliation: The −$17,966 year-0 outflow under Outside funding is exactly compensated by the present value of the constant $1,695.86/year stream:</w:t>
+        <w:t xml:space="preserve">The Outside − Inside (PV @ 7%) column sums to approximately zero across all 21 rows — the decisive empirical evidence of the algebraic identity proved in Section 4. The −$17,966 year-0 outflow is exactly compensated by the present value of the 20-year constant $1,696 distribution stream:</w:t>
       </w:r>
     </w:p>
     <w:p>
@@ -7915,6 +7734,14 @@
         <w:pStyle w:val="FirstParagraph"/>
       </w:pPr>
       <w:r>
+        <w:t xml:space="preserve">Equivalently, the Inside ΔATCF total PV at 7% ($9,766) equals the Outside ΔATCF total PV at 7% ($9,766) to the dollar — the two paths produce identical PV value at the portfolio rate.</w:t>
+      </w:r>
+    </w:p>
+    <w:p>
+      <w:pPr>
+        <w:pStyle w:val="BodyText"/>
+      </w:pPr>
+      <w:r>
         <w:t xml:space="preserve">The household paid $17,966 at year 0 and received its present-value equivalent back over 20 years — at the portfolio rate. This is the algebraic identity in production-system numbers. The Outside scenario’s full-cash-flow IRR of 15.01% exceeds the portfolio rate by ~8 percentage points; this excess captures the rate-arbitrage Core, IRMAA savings, and tax-drag components that ride on top of the (PV-zero-at-7%) SRC. The Inside scenario has no outside outlay, so its full-cash-flow IRR is undefined; only the Outside path admits a meaningful IRR measurement on the</w:t>
       </w:r>
       <w:r>
@@ -7963,7 +7790,7 @@
         <w:pStyle w:val="Compact"/>
         <w:numPr>
           <w:ilvl w:val="0"/>
-          <w:numId w:val="1004"/>
+          <w:numId w:val="1003"/>
         </w:numPr>
       </w:pPr>
       <w:r>
@@ -8033,7 +7860,7 @@
         <w:pStyle w:val="Compact"/>
         <w:numPr>
           <w:ilvl w:val="0"/>
-          <w:numId w:val="1004"/>
+          <w:numId w:val="1003"/>
         </w:numPr>
       </w:pPr>
       <w:r>
@@ -11144,7 +10971,7 @@
         <w:pStyle w:val="Compact"/>
         <w:numPr>
           <w:ilvl w:val="0"/>
-          <w:numId w:val="1005"/>
+          <w:numId w:val="1004"/>
         </w:numPr>
       </w:pPr>
       <w:r>
@@ -11172,7 +10999,7 @@
         <w:pStyle w:val="Compact"/>
         <w:numPr>
           <w:ilvl w:val="0"/>
-          <w:numId w:val="1005"/>
+          <w:numId w:val="1004"/>
         </w:numPr>
       </w:pPr>
       <w:r>
@@ -11184,7 +11011,7 @@
         <w:pStyle w:val="Compact"/>
         <w:numPr>
           <w:ilvl w:val="0"/>
-          <w:numId w:val="1005"/>
+          <w:numId w:val="1004"/>
         </w:numPr>
       </w:pPr>
       <w:r>
@@ -11196,7 +11023,7 @@
         <w:pStyle w:val="Compact"/>
         <w:numPr>
           <w:ilvl w:val="0"/>
-          <w:numId w:val="1005"/>
+          <w:numId w:val="1004"/>
         </w:numPr>
       </w:pPr>
       <w:r>
@@ -11483,7 +11310,7 @@
         <w:pStyle w:val="Compact"/>
         <w:numPr>
           <w:ilvl w:val="0"/>
-          <w:numId w:val="1006"/>
+          <w:numId w:val="1005"/>
         </w:numPr>
       </w:pPr>
       <w:r>
@@ -11505,7 +11332,7 @@
         <w:pStyle w:val="Compact"/>
         <w:numPr>
           <w:ilvl w:val="0"/>
-          <w:numId w:val="1006"/>
+          <w:numId w:val="1005"/>
         </w:numPr>
       </w:pPr>
       <w:r>
@@ -11692,7 +11519,7 @@
       <w:pPr>
         <w:numPr>
           <w:ilvl w:val="0"/>
-          <w:numId w:val="1007"/>
+          <w:numId w:val="1006"/>
         </w:numPr>
       </w:pPr>
       <w:r>
@@ -11759,7 +11586,7 @@
       <w:pPr>
         <w:numPr>
           <w:ilvl w:val="0"/>
-          <w:numId w:val="1007"/>
+          <w:numId w:val="1006"/>
         </w:numPr>
       </w:pPr>
       <w:r>
@@ -12019,7 +11846,7 @@
       <w:pPr>
         <w:numPr>
           <w:ilvl w:val="0"/>
-          <w:numId w:val="1008"/>
+          <w:numId w:val="1007"/>
         </w:numPr>
       </w:pPr>
       <w:r>
@@ -12096,7 +11923,7 @@
       <w:pPr>
         <w:numPr>
           <w:ilvl w:val="0"/>
-          <w:numId w:val="1008"/>
+          <w:numId w:val="1007"/>
         </w:numPr>
       </w:pPr>
       <w:r>
@@ -12278,7 +12105,7 @@
       <w:pPr>
         <w:numPr>
           <w:ilvl w:val="0"/>
-          <w:numId w:val="1008"/>
+          <w:numId w:val="1007"/>
         </w:numPr>
       </w:pPr>
       <w:r>
@@ -12325,7 +12152,7 @@
       <w:pPr>
         <w:numPr>
           <w:ilvl w:val="0"/>
-          <w:numId w:val="1008"/>
+          <w:numId w:val="1007"/>
         </w:numPr>
       </w:pPr>
       <w:r>
@@ -14272,7 +14099,7 @@
         <w:pStyle w:val="Compact"/>
         <w:numPr>
           <w:ilvl w:val="0"/>
-          <w:numId w:val="1009"/>
+          <w:numId w:val="1008"/>
         </w:numPr>
       </w:pPr>
       <w:r>
@@ -14320,7 +14147,7 @@
         <w:pStyle w:val="Compact"/>
         <w:numPr>
           <w:ilvl w:val="0"/>
-          <w:numId w:val="1009"/>
+          <w:numId w:val="1008"/>
         </w:numPr>
       </w:pPr>
       <w:r>
@@ -14353,7 +14180,7 @@
         <w:pStyle w:val="Compact"/>
         <w:numPr>
           <w:ilvl w:val="0"/>
-          <w:numId w:val="1009"/>
+          <w:numId w:val="1008"/>
         </w:numPr>
       </w:pPr>
       <w:r>
@@ -14410,7 +14237,7 @@
         <w:pStyle w:val="Compact"/>
         <w:numPr>
           <w:ilvl w:val="0"/>
-          <w:numId w:val="1009"/>
+          <w:numId w:val="1008"/>
         </w:numPr>
       </w:pPr>
       <w:r>
@@ -14478,7 +14305,7 @@
         <w:pStyle w:val="Compact"/>
         <w:numPr>
           <w:ilvl w:val="0"/>
-          <w:numId w:val="1009"/>
+          <w:numId w:val="1008"/>
         </w:numPr>
       </w:pPr>
       <w:r>
@@ -14500,7 +14327,7 @@
         <w:pStyle w:val="Compact"/>
         <w:numPr>
           <w:ilvl w:val="0"/>
-          <w:numId w:val="1009"/>
+          <w:numId w:val="1008"/>
         </w:numPr>
       </w:pPr>
       <w:r>
@@ -14539,7 +14366,7 @@
         <w:pStyle w:val="Compact"/>
         <w:numPr>
           <w:ilvl w:val="0"/>
-          <w:numId w:val="1009"/>
+          <w:numId w:val="1008"/>
         </w:numPr>
       </w:pPr>
       <w:r>
@@ -14897,9 +14724,6 @@
     <w:abstractNumId w:val="991"/>
   </w:num>
   <w:num w:numId="1003">
-    <w:abstractNumId w:val="991"/>
-  </w:num>
-  <w:num w:numId="1004">
     <w:abstractNumId w:val="99411"/>
     <w:lvlOverride w:ilvl="0">
       <w:startOverride w:val="1"/>
@@ -14929,6 +14753,9 @@
       <w:startOverride w:val="1"/>
     </w:lvlOverride>
   </w:num>
+  <w:num w:numId="1004">
+    <w:abstractNumId w:val="991"/>
+  </w:num>
   <w:num w:numId="1005">
     <w:abstractNumId w:val="991"/>
   </w:num>
@@ -14936,9 +14763,6 @@
     <w:abstractNumId w:val="991"/>
   </w:num>
   <w:num w:numId="1007">
-    <w:abstractNumId w:val="991"/>
-  </w:num>
-  <w:num w:numId="1008">
     <w:abstractNumId w:val="99411"/>
     <w:lvlOverride w:ilvl="0">
       <w:startOverride w:val="1"/>
@@ -14968,7 +14792,7 @@
       <w:startOverride w:val="1"/>
     </w:lvlOverride>
   </w:num>
-  <w:num w:numId="1009">
+  <w:num w:numId="1008">
     <w:abstractNumId w:val="991"/>
   </w:num>
 </w:numbering>

</xml_diff>

<commit_message>
Fix math-mode escaped dollar in section 5B.4 FA comparison
</commit_message>
<xml_diff>
--- a/exports/synthetic-roth-contribution.docx
+++ b/exports/synthetic-roth-contribution.docx
@@ -10744,36 +10744,12 @@
         <m:r>
           <m:t>K</m:t>
         </m:r>
-        <m:r>
-          <m:rPr>
-            <m:sty m:val="p"/>
-          </m:rPr>
-          <m:t>=</m:t>
-        </m:r>
-        <m:r>
-          <m:rPr>
-            <m:sty m:val="p"/>
-          </m:rPr>
-          <m:t>$</m:t>
-        </m:r>
-        <m:r>
-          <m:t>17</m:t>
-        </m:r>
-        <m:r>
-          <m:rPr>
-            <m:sty m:val="p"/>
-          </m:rPr>
-          <m:t>,</m:t>
-        </m:r>
-        <m:r>
-          <m:t>966</m:t>
-        </m:r>
       </m:oMath>
       <w:r>
         <w:t xml:space="preserve"> </w:t>
       </w:r>
       <w:r>
-        <w:t xml:space="preserve">distributed via FA over 20 years would yield a lifetime nominal payout of $17,966 × 1.88786 = $33,917.27. RMD’s multiplier exceeds FA’s by ~2.1× because RMD distributes over 30 years instead of 20, giving</w:t>
+        <w:t xml:space="preserve">= $17,966 distributed via FA over 20 years would yield a lifetime nominal payout of $17,966 × 1.88786 = $33,917.27. RMD’s multiplier exceeds FA’s by ~2.1× because RMD distributes over 30 years instead of 20, giving</w:t>
       </w:r>
       <w:r>
         <w:t xml:space="preserve"> </w:t>

</xml_diff>

<commit_message>
Restore list-style on prose-paper ol/ul (was reset by Tailwind preflight)
</commit_message>
<xml_diff>
--- a/exports/synthetic-roth-contribution.docx
+++ b/exports/synthetic-roth-contribution.docx
@@ -11766,7 +11766,7 @@
         <w:t xml:space="preserve"> </w:t>
       </w:r>
       <w:r>
-        <w:t xml:space="preserve">A per-year IRR / PV / FV bucket for the funding-source effect — with the algebraic identity</w:t>
+        <w:t xml:space="preserve">A per-year PV / FV / IRR bucket for the funding-source effect — with the algebraic identity</w:t>
       </w:r>
       <w:r>
         <w:t xml:space="preserve"> </w:t>
@@ -12617,7 +12617,7 @@
               <w:pStyle w:val="Compact"/>
             </w:pPr>
             <w:r>
-              <w:t xml:space="preserve">IRMAA Savings (FV)</w:t>
+              <w:t xml:space="preserve">Medicare-Surcharge Savings (FV)</w:t>
             </w:r>
           </w:p>
         </w:tc>
@@ -12652,7 +12652,7 @@
               <w:pStyle w:val="Compact"/>
             </w:pPr>
             <w:r>
-              <w:t xml:space="preserve">IRMAA Savings (PV)</w:t>
+              <w:t xml:space="preserve">Medicare-Surcharge Savings (PV)</w:t>
             </w:r>
           </w:p>
         </w:tc>
@@ -13405,7 +13405,7 @@
               <w:pStyle w:val="Compact"/>
             </w:pPr>
             <w:r>
-              <w:t xml:space="preserve">IRMAA Savings (FV)</w:t>
+              <w:t xml:space="preserve">Medicare-Surcharge Savings (FV)</w:t>
             </w:r>
           </w:p>
         </w:tc>
@@ -13440,7 +13440,7 @@
               <w:pStyle w:val="Compact"/>
             </w:pPr>
             <w:r>
-              <w:t xml:space="preserve">IRMAA Savings (PV)</w:t>
+              <w:t xml:space="preserve">Medicare-Surcharge Savings (PV)</w:t>
             </w:r>
           </w:p>
         </w:tc>
@@ -13812,23 +13812,17 @@
         </w:numPr>
       </w:pPr>
       <w:r>
-        <w:t xml:space="preserve">The</w:t>
-      </w:r>
-      <w:r>
-        <w:t xml:space="preserve"> </w:t>
-      </w:r>
-      <w:r>
         <w:rPr>
           <w:b/>
           <w:bCs/>
         </w:rPr>
-        <w:t xml:space="preserve">Synthetic Roth Contribution (FV)</w:t>
-      </w:r>
-      <w:r>
-        <w:t xml:space="preserve"> </w:t>
-      </w:r>
-      <w:r>
-        <w:t xml:space="preserve">is empirically validated: Outside FA = $33,917.27 =</w:t>
+        <w:t xml:space="preserve">Synthetic Roth Contribution (FV).</w:t>
+      </w:r>
+      <w:r>
+        <w:t xml:space="preserve"> </w:t>
+      </w:r>
+      <w:r>
+        <w:t xml:space="preserve">Outside FA = $33,917.27 =</w:t>
       </w:r>
       <w:r>
         <w:t xml:space="preserve"> </w:t>
@@ -13848,29 +13842,7 @@
         <w:t xml:space="preserve"> </w:t>
       </w:r>
       <w:r>
-        <w:t xml:space="preserve">annuity-factor multiple = $17,966 × 1.88786. Outside RMD = $71,229.59 ≈ the nominal 30-year (Outside − Inside) ATCF delta of $71,229.46. The stored SRC value captures the lifetime nominal payoff across both distribution methods.</w:t>
-      </w:r>
-    </w:p>
-    <w:p>
-      <w:pPr>
-        <w:pStyle w:val="Compact"/>
-        <w:numPr>
-          <w:ilvl w:val="0"/>
-          <w:numId w:val="1008"/>
-        </w:numPr>
-      </w:pPr>
-      <w:r>
-        <w:rPr>
-          <w:b/>
-          <w:bCs/>
-        </w:rPr>
-        <w:t xml:space="preserve">RMD’s higher SRC</w:t>
-      </w:r>
-      <w:r>
-        <w:t xml:space="preserve"> </w:t>
-      </w:r>
-      <w:r>
-        <w:t xml:space="preserve">(~$71,230 vs FA’s ~$33,917) reflects the longer compounding horizon: RMD’s beneficiary 10-year window extends the SRC compound period beyond the owner-only horizon of FA, increasing nominal lifetime value. PV at 7% is identical across methods ($17,966 =</w:t>
+        <w:t xml:space="preserve">1.88786; Outside RMD = $71,229.59 ≈ nominal 30-year (Outside − Inside) ATCF delta of $71,229.46. RMD’s larger nominal SRC reflects the longer compounding horizon — RMD’s 10-year beneficiary window extends the SRC compound period beyond FA’s owner-only 20 years. PV at 7% is identical across methods ($17,966 =</w:t>
       </w:r>
       <w:r>
         <w:t xml:space="preserve"> </w:t>
@@ -13881,7 +13853,7 @@
         </m:r>
       </m:oMath>
       <w:r>
-        <w:t xml:space="preserve">) — exactly the algebraic identity of §4.</w:t>
+        <w:t xml:space="preserve">), as the §4 identity requires.</w:t>
       </w:r>
     </w:p>
     <w:p>
@@ -13938,7 +13910,7 @@
         <w:t xml:space="preserve"> </w:t>
       </w:r>
       <w:r>
-        <w:t xml:space="preserve">(25.23% vs FA’s 22.39%) because RMD’s later, larger withdrawals push more of the lifetime distributions into higher brackets, increasing the time-weighted average.</w:t>
+        <w:t xml:space="preserve">(25.23% vs FA’s 22.39%) because RMD’s later, larger withdrawals push more lifetime distributions into higher brackets.</w:t>
       </w:r>
     </w:p>
     <w:p>
@@ -13960,7 +13932,7 @@
         <w:t xml:space="preserve"> </w:t>
       </w:r>
       <w:r>
-        <w:t xml:space="preserve">is non-zero only in Outside scenarios because it captures the value of</w:t>
+        <w:t xml:space="preserve">is non-zero only under Outside payment — it captures the value of</w:t>
       </w:r>
       <w:r>
         <w:t xml:space="preserve"> </w:t>
@@ -13974,7 +13946,7 @@
         <w:t xml:space="preserve"> </w:t>
       </w:r>
       <w:r>
-        <w:t xml:space="preserve">dollars escaping taxable-account drag; this effect does not exist when no outside dollars are migrated into the Roth wrapper. Magnitudes here are small because the scenarios use a modest</w:t>
+        <w:t xml:space="preserve">dollars escaping taxable-account drag. Magnitudes here are small because the scenarios use a modest</w:t>
       </w:r>
       <w:r>
         <w:t xml:space="preserve"> </w:t>
@@ -14022,13 +13994,13 @@
           <w:b/>
           <w:bCs/>
         </w:rPr>
-        <w:t xml:space="preserve">Tax-Rate Spread, IRMAA Savings, and RMD Tax-Drag are identical between Inside and Outside</w:t>
-      </w:r>
-      <w:r>
-        <w:t xml:space="preserve"> </w:t>
-      </w:r>
-      <w:r>
-        <w:t xml:space="preserve">within each distribution method — confirming these components are independent of payment source, as the SRC framework predicts.</w:t>
+        <w:t xml:space="preserve">Tax-Rate Spread, Medicare-Surcharge Savings, and RMD Tax-Drag are identical between Inside and Outside</w:t>
+      </w:r>
+      <w:r>
+        <w:t xml:space="preserve"> </w:t>
+      </w:r>
+      <w:r>
+        <w:t xml:space="preserve">within each distribution method — confirming these components are funding-source-independent, as the SRC framework predicts.</w:t>
       </w:r>
     </w:p>
     <w:p>
@@ -14050,7 +14022,7 @@
         <w:t xml:space="preserve"> </w:t>
       </w:r>
       <w:r>
-        <w:t xml:space="preserve">because Outside’s distribution stream includes the year-by-year +$1,695.86 increment from the SRC (under FA). The Outside FV equals approximately Inside FV + (</w:t>
+        <w:t xml:space="preserve">because Outside’s distribution stream includes the year-by-year SRC increment. Under FA: Outside FV ≈ Inside FV + (</w:t>
       </w:r>
       <m:oMath>
         <m:r>
@@ -14067,7 +14039,7 @@
         <w:t xml:space="preserve"> </w:t>
       </w:r>
       <w:r>
-        <w:t xml:space="preserve">Annuity-Factor Multiple) = $31,937 + $33,917 = $65,854.</w:t>
+        <w:t xml:space="preserve">annuity-factor multiple) = $31,937 + $33,917 = $65,854.</w:t>
       </w:r>
     </w:p>
     <w:p>
@@ -14089,7 +14061,7 @@
         <w:t xml:space="preserve"> </w:t>
       </w:r>
       <w:r>
-        <w:t xml:space="preserve">is undefined under Inside payment (no outside outlay; cash-flow stream is purely positive). Under Outside payment it is meaningful: the rate at which the conversion’s full cash-flow profile produces NPV = 0. The Outside IRR exceeds the portfolio rate by the combined spread + IRMAA + tax-drag alpha, on top of the PV-zero-at-</w:t>
+        <w:t xml:space="preserve">is undefined under Inside payment (no outside outlay; cash-flow stream is purely positive). Under Outside it is meaningful: the Outside IRR exceeds the portfolio rate by the combined spread + Medicare-surcharge + tax-drag alpha, on top of the PV-zero-at-</w:t>
       </w:r>
       <m:oMath>
         <m:r>

</xml_diff>

<commit_message>
Tighten table cell spacing via custom reference docx
</commit_message>
<xml_diff>
--- a/exports/synthetic-roth-contribution.docx
+++ b/exports/synthetic-roth-contribution.docx
@@ -259,7 +259,7 @@
         <w:pStyle w:val="BodyText"/>
       </w:pPr>
       <w:r>
-        <w:t xml:space="preserve">These results extend Reichenstein &amp; Meyer (2017), McQuarrie &amp; DiLellio (2023), Vanguard’s 2025 BETR, and Nalebuff/Haghani/White (2025) by adding a separable per-year decomposition with a closed-form identity, and reconcile McQuarrie (2024)’s</w:t>
+        <w:t xml:space="preserve">Prior treatments — Reichenstein &amp; Meyer (2017), McQuarrie &amp; DiLellio (2023), Vanguard’s 2025 BETR, Nalebuff/Haghani/White (2025) — recognize the wrapper migration but treat the migrated tax as a forgone cost. We formalize it as a separable asset with its own per-year cash flow and closed-form PV identity, and reconcile McQuarrie (2024)’s</w:t>
       </w:r>
       <w:r>
         <w:t xml:space="preserve"> </w:t>
@@ -271,7 +271,7 @@
         <w:t xml:space="preserve"> </w:t>
       </w:r>
       <w:r>
-        <w:t xml:space="preserve">conclusion by incorporating the post-conversion Roth balance into the NPV accounting.</w:t>
+        <w:t xml:space="preserve">conclusion by incorporating the SRC into the NPV accounting.</w:t>
       </w:r>
     </w:p>
     <w:p>
@@ -11588,7 +11588,7 @@
         <w:t xml:space="preserve"> </w:t>
       </w:r>
       <w:r>
-        <w:t xml:space="preserve">— turning the conversion tax from a cost into an investment. The payoff is the tax-drag-avoidance alpha of §6 ($1,021 PV in the Outside RMD scenario), added to the conversion alpha sum to give total Outside-conversion alpha.</w:t>
+        <w:t xml:space="preserve">— the IRS allows this conversion-tax investment (SRC) that others miscast as a cost. The payoff is the tax-drag-avoidance alpha of §6 ($1,021 PV in the Outside RMD scenario), added to the conversion alpha sum to give total Outside-conversion alpha.</w:t>
       </w:r>
     </w:p>
     <w:p>
@@ -11596,7 +11596,7 @@
         <w:pStyle w:val="FirstParagraph"/>
       </w:pPr>
       <w:r>
-        <w:t xml:space="preserve">The SRC materializes only as a side effect of choosing Outside funding for an already-decided conversion.</w:t>
+        <w:t xml:space="preserve">Once the conversion decision is made, Outside funding is simply an added capital allocation decision.</w:t>
       </w:r>
     </w:p>
     <w:p>
@@ -11621,7 +11621,7 @@
         <w:pStyle w:val="FirstParagraph"/>
       </w:pPr>
       <w:r>
-        <w:t xml:space="preserve">The Synthetic Roth Contribution is the dollar-for-dollar economic equivalent of a Roth contribution that occurs implicitly when conversion tax is paid from outside the retirement account. The framework was introduced in Cheshire (2025, SSRN 5205840) and is rigorously extended here. We have demonstrated its existence and properties four independent ways:</w:t>
+        <w:t xml:space="preserve">The Synthetic Roth Contribution is the economic equivalent of a Roth contribution that occurs when conversion tax is paid from outside the retirement account. Cheshire (2025, SSRN 5205840) introduced the concept; this paper proves it four independent ways:</w:t>
       </w:r>
     </w:p>
     <w:p>
@@ -11642,7 +11642,7 @@
         <w:t xml:space="preserve"> </w:t>
       </w:r>
       <w:r>
-        <w:t xml:space="preserve">The annuity-payment / present-value identity proves that when the discount rate equals the portfolio rate, the Outside vs Inside PV difference is exactly zero — yet the Outside-funded household receives a constant</w:t>
+        <w:t xml:space="preserve">The annuity-payment / present-value identity proves that when the discount rate equals the portfolio rate, the Outside vs Inside PV difference is exactly zero — yet Outside funding creates a constant</w:t>
       </w:r>
       <w:r>
         <w:t xml:space="preserve"> </w:t>
@@ -11834,7 +11834,7 @@
         <w:t xml:space="preserve"> </w:t>
       </w:r>
       <w:r>
-        <w:t xml:space="preserve">The realized end-of-life wealth difference between Outside and Inside paths cannot be reconciled without including the SRC term as a first-class component alongside spread arbitrage, Medicare-surcharge savings, and reduced-RMD tax-drag.</w:t>
+        <w:t xml:space="preserve">The realized FV difference between Outside and Inside paths cannot be reconciled without including the SRC term as a separable component alongside spread arbitrage, Medicare-surcharge savings, and reduced-RMD tax-drag.</w:t>
       </w:r>
     </w:p>
     <w:p>
@@ -11903,7 +11903,7 @@
           <w:b/>
           <w:bCs/>
         </w:rPr>
-        <w:t xml:space="preserve">Including the SRC turns Roth conversion analysis from a tax-rate-spread question into a wrapper-allocation question.</w:t>
+        <w:t xml:space="preserve">Establishing the SRC turns Roth conversion analysis from a tax-rate-spread calculation into a convert plus wrapper-allocation decision.</w:t>
       </w:r>
     </w:p>
     <w:p>
@@ -11930,13 +11930,13 @@
           <w:b/>
           <w:bCs/>
         </w:rPr>
-        <w:t xml:space="preserve">The SRC framework is the first separable decomposition.</w:t>
-      </w:r>
-      <w:r>
-        <w:t xml:space="preserve"> </w:t>
-      </w:r>
-      <w:r>
-        <w:t xml:space="preserve">A PV / FV / IRR bucket for the funding-source effect — with the algebraic identity</w:t>
+        <w:t xml:space="preserve">The SRC is a separable wrapper migration with its own PV / FV / IRR identity.</w:t>
+      </w:r>
+      <w:r>
+        <w:t xml:space="preserve"> </w:t>
+      </w:r>
+      <w:r>
+        <w:t xml:space="preserve">The matched-rate PV identity</w:t>
       </w:r>
       <w:r>
         <w:t xml:space="preserve"> </w:t>
@@ -12000,7 +12000,7 @@
         <w:t xml:space="preserve"> </w:t>
       </w:r>
       <w:r>
-        <w:t xml:space="preserve">at the portfolio rate — has not, to our knowledge, been published outside this framework. Reichenstein &amp; Meyer (2017), Vanguard BETR (2025), and Nalebuff/Haghani/White (2025) each capture related parts but do not state the identity.</w:t>
+        <w:t xml:space="preserve">at the portfolio rate has not, to our knowledge, been published outside this framework. Reichenstein &amp; Meyer (2017), Vanguard BETR (2025), and Nalebuff/Haghani/White (2025) each capture related parts but do not state the identity.</w:t>
       </w:r>
     </w:p>
     <w:p>
@@ -12015,13 +12015,61 @@
           <w:b/>
           <w:bCs/>
         </w:rPr>
-        <w:t xml:space="preserve">The SRC is separable from the rate-arbitrage Core.</w:t>
-      </w:r>
-      <w:r>
-        <w:t xml:space="preserve"> </w:t>
-      </w:r>
-      <w:r>
-        <w:t xml:space="preserve">Calculators that pool them into a single</w:t>
+        <w:t xml:space="preserve">The SRC’s tax-drag-avoidance alpha is a fourth conversion alpha component.</w:t>
+      </w:r>
+      <w:r>
+        <w:t xml:space="preserve"> </w:t>
+      </w:r>
+      <w:r>
+        <w:t xml:space="preserve">Alongside the rate-arbitrage Core, Medicare-surcharge-reduction alpha, and RMD tax-drag alpha, the SRC’s tax-drag-avoidance alpha (under Outside funding) emerges from</w:t>
+      </w:r>
+      <w:r>
+        <w:t xml:space="preserve"> </w:t>
+      </w:r>
+      <m:oMath>
+        <m:r>
+          <m:t>K</m:t>
+        </m:r>
+      </m:oMath>
+      <w:r>
+        <w:t xml:space="preserve"> </w:t>
+      </w:r>
+      <w:r>
+        <w:t xml:space="preserve">compounding at the Roth’s tax-free</w:t>
+      </w:r>
+      <w:r>
+        <w:t xml:space="preserve"> </w:t>
+      </w:r>
+      <m:oMath>
+        <m:r>
+          <m:t>r</m:t>
+        </m:r>
+      </m:oMath>
+      <w:r>
+        <w:t xml:space="preserve"> </w:t>
+      </w:r>
+      <w:r>
+        <w:t xml:space="preserve">instead of the taxable account’s drag-affected</w:t>
+      </w:r>
+      <w:r>
+        <w:t xml:space="preserve"> </w:t>
+      </w:r>
+      <m:oMath>
+        <m:sSub>
+          <m:e>
+            <m:r>
+              <m:t>r</m:t>
+            </m:r>
+          </m:e>
+          <m:sub>
+            <m:r>
+              <m:t>d</m:t>
+            </m:r>
+          </m:sub>
+        </m:sSub>
+      </m:oMath>
+      <w:r>
+        <w:t xml:space="preserve">. Calculators that pool funding-source into a single</w:t>
       </w:r>
       <w:r>
         <w:t xml:space="preserve"> </w:t>
@@ -12033,7 +12081,7 @@
         <w:t xml:space="preserve"> </w:t>
       </w:r>
       <w:r>
-        <w:t xml:space="preserve">miss the SRC’s distinct economic signal — especially when</w:t>
+        <w:t xml:space="preserve">miss this distinct signal — especially when</w:t>
       </w:r>
       <w:r>
         <w:t xml:space="preserve"> </w:t>
@@ -12071,7 +12119,7 @@
         </m:sSub>
       </m:oMath>
       <w:r>
-        <w:t xml:space="preserve">, where the rate-arbitrage Core is negative but the SRC’s tax-drag-avoidance alpha (under Outside funding) can still render the household total favorable.</w:t>
+        <w:t xml:space="preserve">, where the rate-arbitrage Core is negative but the tax-drag-avoidance alpha can still render a positive total.</w:t>
       </w:r>
     </w:p>
     <w:p>
@@ -12086,74 +12134,25 @@
           <w:b/>
           <w:bCs/>
         </w:rPr>
-        <w:t xml:space="preserve">The</w:t>
-      </w:r>
-      <w:r>
-        <w:rPr>
-          <w:b/>
-          <w:bCs/>
-        </w:rPr>
-        <w:t xml:space="preserve"> </w:t>
-      </w:r>
-      <w:r>
-        <w:rPr>
-          <w:b/>
-          <w:bCs/>
-        </w:rPr>
-        <w:t xml:space="preserve">“live past 97 to break even”</w:t>
-      </w:r>
-      <w:r>
-        <w:rPr>
-          <w:b/>
-          <w:bCs/>
-        </w:rPr>
-        <w:t xml:space="preserve"> </w:t>
-      </w:r>
-      <w:r>
-        <w:rPr>
-          <w:b/>
-          <w:bCs/>
-        </w:rPr>
-        <w:t xml:space="preserve">framing no longer holds under SRC accounting.</w:t>
-      </w:r>
-      <w:r>
-        <w:t xml:space="preserve"> </w:t>
-      </w:r>
-      <w:r>
-        <w:t xml:space="preserve">McQuarrie (2024)’s pessimism rests on running NPV entirely off the Traditional shadow balance — structurally omitting the post-conversion Roth balance and treating the conversion tax as a one-sided cost rather than a wrapper migration of the household’s own funds. There is no recoupment-age threshold: a conversion has no time-horizon break-even because there is no cost. The framing also misreads the household’s saving intent — saving deliberately defers consumption to retirement or to heirs; a recoupment horizon at age 97 doesn’t make a conversion bad, it confirms the household is doing what investing is for.</w:t>
-      </w:r>
-    </w:p>
-    <w:p>
-      <w:pPr>
-        <w:numPr>
-          <w:ilvl w:val="0"/>
-          <w:numId w:val="1008"/>
-        </w:numPr>
-      </w:pPr>
-      <w:r>
-        <w:rPr>
-          <w:b/>
-          <w:bCs/>
-        </w:rPr>
-        <w:t xml:space="preserve">The conversion decision is PV of alpha components, not rules of thumb.</w:t>
-      </w:r>
-      <w:r>
-        <w:t xml:space="preserve"> </w:t>
-      </w:r>
-      <w:r>
-        <w:t xml:space="preserve">The</w:t>
-      </w:r>
-      <w:r>
-        <w:t xml:space="preserve"> </w:t>
-      </w:r>
-      <w:r>
-        <w:t xml:space="preserve">“convert only when future tax rates are higher”</w:t>
-      </w:r>
-      <w:r>
-        <w:t xml:space="preserve"> </w:t>
-      </w:r>
-      <w:r>
-        <w:t xml:space="preserve">rule captures the rate-arbitrage Core in isolation and ignores Medicare-surcharge-reduction and RMD tax-drag — both of which can flip the decision. Households deferring otherwise-favorable conversions on the basis of published recoupment-age advice are reacting to an incomplete accounting, not to the math.</w:t>
+        <w:t xml:space="preserve">Break-even time frames no longer hold under SRC accounting.</w:t>
+      </w:r>
+      <w:r>
+        <w:t xml:space="preserve"> </w:t>
+      </w:r>
+      <w:r>
+        <w:t xml:space="preserve">Profits are booked at conversion time and play out over the horizon — there is no recoupment-age threshold because there is no cost. McQuarrie (2024)’s age-97 break-even is one example: discounted RMD savings are computed against a one-sided conversion-tax</w:t>
+      </w:r>
+      <w:r>
+        <w:t xml:space="preserve"> </w:t>
+      </w:r>
+      <w:r>
+        <w:t xml:space="preserve">“cost”</w:t>
+      </w:r>
+      <w:r>
+        <w:t xml:space="preserve"> </w:t>
+      </w:r>
+      <w:r>
+        <w:t xml:space="preserve">rather than against a wrapper migration of the household’s own funds. The framing also misreads saving intent: a horizon out to age 97 doesn’t make a conversion bad, it confirms the household is doing what investing is for.</w:t>
       </w:r>
     </w:p>
     <w:p>
@@ -14661,7 +14660,7 @@
     <w:basedOn w:val="BodyText"/>
     <w:qFormat/>
     <w:pPr>
-      <w:spacing w:after="36" w:before="36"/>
+      <w:spacing w:after="0" w:before="0" w:line="240" w:lineRule="auto"/>
     </w:pPr>
   </w:style>
   <w:style w:styleId="Title" w:type="paragraph">

</xml_diff>